<commit_message>
Fix playtest breaks without rebalancing the trace.
Dead batteries no longer keep radar, UAV reads the drone controller, selling no longer needs the main hand, and handles stay random. Rack income is one mint per owner inside a radius. The visible coin is Koryazhma coin.

Co-authored-by: arena-agent <297053741+arena-agent@users.noreply.github.com>
</commit_message>
<xml_diff>
--- a/docs/cherny-kanal-gajd.docx
+++ b/docs/cherny-kanal-gajd.docx
@@ -55,7 +55,7 @@
         <w:pStyle w:val="List"/>
       </w:pPr>
       <w:r>
-        <w:t xml:space="preserve">ПКМ по телефону: чат, радар, рынок, сеть. Шифт+ПКМ — авиарежим, тебя нет в эфире.</w:t>
+        <w:t xml:space="preserve">ПКМ по телефону: чат, радар, рынок, сеть. Шифт+ПКМ — авиарежим, тебя нет в эфире. Строка ввода сразу в фокусе: клавиша инвентаря печатает букву, меню закрывает Escape.</w:t>
       </w:r>
     </w:p>
     <w:p>
@@ -71,15 +71,15 @@
         <w:pStyle w:val="List"/>
       </w:pPr>
       <w:r>
-        <w:t xml:space="preserve">Позывной выдаётся сам, вида ghost-fox-42. Сменить: /bc sethandle имя</w:t>
-      </w:r>
-    </w:p>
-    <w:p>
-      <w:pPr>
-        <w:pStyle w:val="List"/>
-      </w:pPr>
-      <w:r>
-        <w:t xml:space="preserve">Хэш-коины — внутриигровая валюта. ПКМ кладёт стопку в кошелёк, шифт+ПКМ снимает до 16. Заряженная стойка чеканит монеты сама.</w:t>
+        <w:t xml:space="preserve">Позывной выдаётся сам, вида ghost-fox-42. Командой его не выбрать. Новая SIM сжигает старый и выдаёт другой случайный.</w:t>
+      </w:r>
+    </w:p>
+    <w:p>
+      <w:pPr>
+        <w:pStyle w:val="List"/>
+      </w:pPr>
+      <w:r>
+        <w:t xml:space="preserve">Коряжма-коины — внутриигровая валюта. ПКМ кладёт стопку в кошелёк, шифт+ПКМ снимает до 16. Заряженная стойка чеканит монеты: одна выплата на владельца в 96 блоках, дальняя база чеканит отдельно.</w:t>
       </w:r>
     </w:p>
     <w:p>
@@ -271,7 +271,7 @@
         <w:pStyle w:val="Normal"/>
       </w:pPr>
       <w:r>
-        <w:t xml:space="preserve">Телефон видит на 52 блока, ноутбук на 110. Своя тарелка в 128 блоках добавляет ещё 80. На радаре до 32 точек.</w:t>
+        <w:t xml:space="preserve">Телефон видит на 52 блока, ноутбук на 110. Берётся большее, они не складываются. Своя или отрядная тарелка в 128 блоках добавляет ещё 80, и тоже один раз. Чужая тарелка дальность не растит. На радаре до 32 точек. Разряженная батарея гасит и твой радар, и твою отметку. Второй прибор с зарядом считается живым.</w:t>
       </w:r>
     </w:p>
     <w:p>
@@ -303,7 +303,7 @@
         <w:pStyle w:val="List"/>
       </w:pPr>
       <w:r>
-        <w:t xml:space="preserve">Кнопка меток включает маленький радар в углу экрана, когда меню закрыто. Шифт+ПКМ по ноутбуку делает то же самое.</w:t>
+        <w:t xml:space="preserve">Кнопка меток включает маленький радар в углу экрана, когда меню закрыто. Дальность не растит. Шифт+ПКМ по ноутбуку делает то же самое.</w:t>
       </w:r>
     </w:p>
     <w:p>
@@ -319,7 +319,7 @@
         <w:pStyle w:val="Normal"/>
       </w:pPr>
       <w:r>
-        <w:t xml:space="preserve">Покупается за хэш-коины из кошелька, не за изумруды. Предмет падает в инвентарь.</w:t>
+        <w:t xml:space="preserve">Покупается за коряжма-коины из кошелька, не за изумруды. Предмет падает в инвентарь. Наведи на кнопку: цена не обрезается.</w:t>
       </w:r>
     </w:p>
     <w:p>
@@ -455,7 +455,7 @@
         <w:pStyle w:val="List"/>
       </w:pPr>
       <w:r>
-        <w:t xml:space="preserve">Погрешность: 8 блоков без VPN, плюс 50 за каждый уровень VPN. Старая отметка добавляет ещё 40. Своя тарелка в 128 блоках ужимает погрешность примерно наполовину, но не ниже 3. Эксплойт в инвентаре ужимает ещё и реже даёт промах.</w:t>
+        <w:t xml:space="preserve">Погрешность по умолчанию: 8 блоков без VPN, плюс 50 за каждый уровень VPN. Это почти GPS, не район. В конфиге traceBaseError и traceVpnError, потолок 2000. Старая отметка добавляет ещё 40. Своя тарелка в 128 блоках ужимает погрешность примерно наполовину, но не ниже 3. Эксплойт в инвентаре ужимает ещё и реже даёт промах.</w:t>
       </w:r>
     </w:p>
     <w:p>
@@ -631,7 +631,7 @@
         <w:pStyle w:val="Normal"/>
       </w:pPr>
       <w:r>
-        <w:t xml:space="preserve">Ищет дрон Superb Warfare в 64 блоках, у которого есть живой оператор. Стойка не нужна, ноутбук нужен. Погрешность около 30–41 блока. Перезарядка общая со TRACE. Если у оператора IDS, он получает пеленг.</w:t>
+        <w:t xml:space="preserve">Ищет дрон Superb Warfare или продвинутый дрон EW в 96 блоках и читает оператора с пульта. Стойка не нужна, ноутбук нужен. Если дрона нет, так и пишет. Если дрон есть, а пульт не читается, это отдельная фраза, не «нет дрона». Погрешность около 30–41 блока. Перезарядка общая со TRACE. Если у оператора IDS, он получает пеленг.</w:t>
       </w:r>
     </w:p>
     <w:p>
@@ -671,7 +671,7 @@
         <w:pStyle w:val="List"/>
       </w:pPr>
       <w:r>
-        <w:t xml:space="preserve">SELL ITEM продаёт один предмет из основной руки. По умолчанию 12, тоже через $число. Телефон и ноутбук продать нельзя.</w:t>
+        <w:t xml:space="preserve">SELL ITEM продаёт предмет из второй руки, иначе первый не-прибор из хотбара. Ноутбук может оставаться в основной руке. По умолчанию 12, тоже через $число. Телефон и ноутбук продать нельзя.</w:t>
       </w:r>
     </w:p>
     <w:p>
@@ -759,7 +759,7 @@
         <w:pStyle w:val="Normal"/>
       </w:pPr>
       <w:r>
-        <w:t xml:space="preserve">Держит тёмный канал в 72 блоках для владельца и для тех, у кого тот же код отряда. Пока заряжена и у неё есть владелец, раз в минуту кладёт ему 4 хэш-коина, пока кошелёк не упрётся в 5000.</w:t>
+        <w:t xml:space="preserve">Держит тёмный канал в 72 блоках для владельца и для тех, у кого тот же код отряда. Пока заряжена и у неё есть владелец, раз в минуту кладёт ему 4 коряжма-коина, пока кошелёк не упрётся в 5000. В радиусе rackMintRange, по умолчанию 96, платит только одна стойка. База дальше этого радиуса чеканит свою монету отдельно.</w:t>
       </w:r>
     </w:p>
     <w:p>
@@ -951,7 +951,7 @@
         <w:pStyle w:val="List"/>
       </w:pPr>
       <w:r>
-        <w:t xml:space="preserve">Хэш-коин — ПКМ вносит всю стопку. Шифт+ПКМ снимает до 16. Крафт из золотого слитка дорогой специально: нормальный доход — стойка.</w:t>
+        <w:t xml:space="preserve">Коряжма-коин — ПКМ вносит всю стопку. Шифт+ПКМ снимает до 16. Крафт из золотого слитка дорогой специально: нормальный доход — стойка. Внутренний id предмета по-прежнему hashcoin, старые стаки не пропадают.</w:t>
       </w:r>
     </w:p>
     <w:p>
@@ -1391,7 +1391,7 @@
         <w:pStyle w:val="List"/>
       </w:pPr>
       <w:r>
-        <w:t xml:space="preserve">Хэш-коин: редстоун, золотой слиток, редстоун.</w:t>
+        <w:t xml:space="preserve">Коряжма-коин: редстоун, золотой слиток, редстоун.</w:t>
       </w:r>
     </w:p>
     <w:p>
@@ -1495,7 +1495,7 @@
         <w:pStyle w:val="List"/>
       </w:pPr>
       <w:r>
-        <w:t xml:space="preserve">/bc sethandle имя — новый позывной. От 3 символов, латиница, цифры, _ и -, до 32. Занятый не взять.</w:t>
+        <w:t xml:space="preserve">Позывной командой не ставится. Это было бесплатное сжигание, его убрали. Новый случайный позывной даёт SIM или WIPE.</w:t>
       </w:r>
     </w:p>
     <w:p>
@@ -1751,7 +1751,7 @@
         <w:pStyle w:val="List"/>
       </w:pPr>
       <w:r>
-        <w:t xml:space="preserve">Погрешность TRACE: 8 + 50 за уровень VPN. Тарелка ужимает, старая отметка раздувает на 40.</w:t>
+        <w:t xml:space="preserve">Погрешность TRACE: traceBaseError + traceVpnError за уровень VPN. Пока 8 и 50. Тарелка ужимает, старая отметка раздувает на 40.</w:t>
       </w:r>
     </w:p>
     <w:p>
@@ -1791,7 +1791,7 @@
         <w:pStyle w:val="List"/>
       </w:pPr>
       <w:r>
-        <w:t xml:space="preserve">«Нет дрона» — в 64 блоках нет дрона Superb Warfare с живым оператором, или крючок дронов выключен.</w:t>
+        <w:t xml:space="preserve">«В 96 блоках нет дрона» — рядом нет дрона, или крючок дронов выключен. «Пульт не читается» — дрон есть, но оператор не прочитался: подойди ближе или сядь за монитор.</w:t>
       </w:r>
     </w:p>
     <w:p>

</xml_diff>

<commit_message>
Add noisy SIGINT views, a sale slot, and EW recipes.
Button tips follow the server config, trace scatter defaults to 500, and radar shows radio stations without locking onto a body.

Co-authored-by: arena-agent <297053741+arena-agent@users.noreply.github.com>
</commit_message>
<xml_diff>
--- a/docs/cherny-kanal-gajd.docx
+++ b/docs/cherny-kanal-gajd.docx
@@ -271,7 +271,7 @@
         <w:pStyle w:val="Normal"/>
       </w:pPr>
       <w:r>
-        <w:t xml:space="preserve">Телефон видит на 52 блока, ноутбук на 110. Берётся большее, они не складываются. Своя или отрядная тарелка в 128 блоках добавляет ещё 80, и тоже один раз. Чужая тарелка дальность не растит. На радаре до 32 точек. Разряженная батарея гасит и твой радар, и твою отметку. Второй прибор с зарядом считается живым.</w:t>
+        <w:t xml:space="preserve">Телефон видит игроков на 52 блока, ноутбук на 110. Берётся большее, они не складываются. Своя или отрядная тарелка добавляет dishRadarBonus, по умолчанию 80, и один раз. Чужая тарелка дальность не растит. Стойки, тарелки, глушилки, клетки, рации EW и радары Ballistix видны дальше: structureRadar 360 с ноутбука, 180 с телефона. Игроков это не удлиняет. Глушилка и клетка гасят стойку внутри сферы: нет канала, нет чекана. Разряженная батарея гасит и твой радар, и твою отметку.</w:t>
       </w:r>
     </w:p>
     <w:p>
@@ -455,7 +455,7 @@
         <w:pStyle w:val="List"/>
       </w:pPr>
       <w:r>
-        <w:t xml:space="preserve">Погрешность по умолчанию: 8 блоков без VPN, плюс 50 за каждый уровень VPN. Это почти GPS, не район. В конфиге traceBaseError и traceVpnError, потолок 2000. Старая отметка добавляет ещё 40. Своя тарелка в 128 блоках ужимает погрешность примерно наполовину, но не ниже 3. Эксплойт в инвентаре ужимает ещё и реже даёт промах.</w:t>
+        <w:t xml:space="preserve">Погрешность по умолчанию: 500 блоков без VPN, плюс 50 за каждый уровень VPN. Это намёк на биом, не дом. Ключ конфига traceScatter. Старый traceBaseError больше не читается. Старая отметка добавляет traceStaleError, по умолчанию 40. Своя тарелка в 128 блоках ужимает погрешность примерно наполовину, но не ниже 3. Эксплойт в инвентаре ужимает ещё и реже даёт промах. Числа на кнопках берутся из конфига сервера.</w:t>
       </w:r>
     </w:p>
     <w:p>
@@ -639,6 +639,30 @@
         <w:pStyle w:val="Heading2"/>
       </w:pPr>
       <w:r>
+        <w:t xml:space="preserve">КАРТА и СУМКА</w:t>
+      </w:r>
+    </w:p>
+    <w:p>
+      <w:pPr>
+        <w:pStyle w:val="Normal"/>
+      </w:pPr>
+      <w:r>
+        <w:t xml:space="preserve">Это не камера от лица жертвы и не живой захват тела. Такой вид отдал бы точные координаты и обнулил погрешность. КАРТА снимает район сохранённой отметки: 16 на 16 клеток, дыры, сдвиг, цвет блоков. Красная точка появляется, только если носитель попал в этот кадр. Иначе на экране пеленг «за кадром», и VPN может его соврать.</w:t>
+      </w:r>
+    </w:p>
+    <w:p>
+      <w:pPr>
+        <w:pStyle w:val="Normal"/>
+      </w:pPr>
+      <w:r>
+        <w:t xml:space="preserve">СУМКА режет инвентарь того же позывного, если он в эфире и в том же измерении. Чем дальше тело от отметки, тем больше чёрных слотов. Часть видимых чисел врёт. Цена и откат в конфиге: opticCost, peekCost.</w:t>
+      </w:r>
+    </w:p>
+    <w:p>
+      <w:pPr>
+        <w:pStyle w:val="Heading2"/>
+      </w:pPr>
+      <w:r>
         <w:t xml:space="preserve">WIPE — сжечь позывной</w:t>
       </w:r>
     </w:p>
@@ -671,7 +695,7 @@
         <w:pStyle w:val="List"/>
       </w:pPr>
       <w:r>
-        <w:t xml:space="preserve">SELL ITEM продаёт предмет из второй руки, иначе первый не-прибор из хотбара. Ноутбук может оставаться в основной руке. По умолчанию 12, тоже через $число. Телефон и ноутбук продать нельзя.</w:t>
+        <w:t xml:space="preserve">Вкладка СЛОТ: перетащи предмет из инвентаря в слот справа. Цена — ползунок или число, за всю стопку. Телефон и ноутбук в слот не кладутся. SELL INTEL продаёт выбранный след за ту же цену.</w:t>
       </w:r>
     </w:p>
     <w:p>
@@ -1460,6 +1484,14 @@
     </w:p>
     <w:p>
       <w:pPr>
+        <w:pStyle w:val="Normal"/>
+      </w:pPr>
+      <w:r>
+        <w:t xml:space="preserve">У Electronic Warfare своих рецептов нет. Мод добавляет их сам: рация, кабель, пеленгатор, глушилки, дрон, пульт, сетка, перехватчик, ЭМИ-пушка, оба ПЗРК и три ракеты. Опора — детали дрона Superb Warfare: пропеллер, мотор, элемент. Ракеты и пушка дороже: незерит, алмаз, динамит. Без Superb Warfare эти рецепты не соберутся.</w:t>
+      </w:r>
+    </w:p>
+    <w:p>
+      <w:pPr>
         <w:pStyle w:val="Heading1"/>
       </w:pPr>
       <w:r>
@@ -1751,7 +1783,7 @@
         <w:pStyle w:val="List"/>
       </w:pPr>
       <w:r>
-        <w:t xml:space="preserve">Погрешность TRACE: traceBaseError + traceVpnError за уровень VPN. Пока 8 и 50. Тарелка ужимает, старая отметка раздувает на 40.</w:t>
+        <w:t xml:space="preserve">Погрешность TRACE: traceScatter + traceVpnError за уровень VPN. Дефолт 500 и 50. Тарелка ужимает, старая отметка добавляет traceStaleError.</w:t>
       </w:r>
     </w:p>
     <w:p>

</xml_diff>

<commit_message>
Fix the radar compile break and draw a facing arrow.
Station fields are read through record accessors, and distSqr stays a double. The phone radar and the corner HUD now show where you are looking.

Co-authored-by: arena-agent <297053741+arena-agent@users.noreply.github.com>
</commit_message>
<xml_diff>
--- a/docs/cherny-kanal-gajd.docx
+++ b/docs/cherny-kanal-gajd.docx
@@ -296,6 +296,14 @@
       </w:pPr>
       <w:r>
         <w:t xml:space="preserve">Чужой VPN сдвигает точку и прячет позывной, пока ты его не деанонил.</w:t>
+      </w:r>
+    </w:p>
+    <w:p>
+      <w:pPr>
+        <w:pStyle w:val="List"/>
+      </w:pPr>
+      <w:r>
+        <w:t xml:space="preserve">В центре радара белая стрелка — это ты. Она смотрит туда же, куда смотришь ты. На экране телефона и на метках в углу.</w:t>
       </w:r>
     </w:p>
     <w:p>

</xml_diff>

<commit_message>
Redraw the laptop, shrink the radar arrow, and scale VPN error.
The laptop dims the world, keeps text inside the panel, and shows a real item card on the bag slice. TRACE now multiplies scatter by the VPN strength instead of adding a flat 50.

Co-authored-by: arena-agent <297053741+arena-agent@users.noreply.github.com>
</commit_message>
<xml_diff>
--- a/docs/cherny-kanal-gajd.docx
+++ b/docs/cherny-kanal-gajd.docx
@@ -303,7 +303,7 @@
         <w:pStyle w:val="List"/>
       </w:pPr>
       <w:r>
-        <w:t xml:space="preserve">В центре радара белая стрелка — это ты. Она смотрит туда же, куда смотришь ты. На экране телефона и на метках в углу.</w:t>
+        <w:t xml:space="preserve">В центре радара маленький зелёный треугольник — это ты. Остриё смотрит туда же, куда смотришь ты. На экране телефона и на метках в углу.</w:t>
       </w:r>
     </w:p>
     <w:p>
@@ -463,7 +463,7 @@
         <w:pStyle w:val="List"/>
       </w:pPr>
       <w:r>
-        <w:t xml:space="preserve">Погрешность по умолчанию: 500 блоков без VPN, плюс 50 за каждый уровень VPN. Это намёк на биом, не дом. Ключ конфига traceScatter. Старый traceBaseError больше не читается. Старая отметка добавляет traceStaleError, по умолчанию 40. Своя тарелка в 128 блоках ужимает погрешность примерно наполовину, но не ниже 3. Эксплойт в инвентаре ужимает ещё и реже даёт промах. Числа на кнопках берутся из конфига сервера.</w:t>
+        <w:t xml:space="preserve">Погрешность по умолчанию: база 500 блоков. Обычный VPN умножает её на 1.5, глубокий на 2. Ключи traceScatter, traceVpnMul, traceVpnDeepMul. Старые traceBaseError и traceVpnError больше не читаются. Старая отметка добавляет traceStaleError, по умолчанию 40. Своя тарелка в 128 блоках ужимает уже умноженное число примерно наполовину, но не ниже 3. Эксплойт ужимает ещё и реже даёт промах. Числа на кнопках берутся из конфига сервера.</w:t>
       </w:r>
     </w:p>
     <w:p>
@@ -647,23 +647,23 @@
         <w:pStyle w:val="Heading2"/>
       </w:pPr>
       <w:r>
-        <w:t xml:space="preserve">КАРТА и СУМКА</w:t>
-      </w:r>
-    </w:p>
-    <w:p>
-      <w:pPr>
-        <w:pStyle w:val="Normal"/>
-      </w:pPr>
-      <w:r>
-        <w:t xml:space="preserve">Это не камера от лица жертвы и не живой захват тела. Такой вид отдал бы точные координаты и обнулил погрешность. КАРТА снимает район сохранённой отметки: 16 на 16 клеток, дыры, сдвиг, цвет блоков. Красная точка появляется, только если носитель попал в этот кадр. Иначе на экране пеленг «за кадром», и VPN может его соврать.</w:t>
-      </w:r>
-    </w:p>
-    <w:p>
-      <w:pPr>
-        <w:pStyle w:val="Normal"/>
-      </w:pPr>
-      <w:r>
-        <w:t xml:space="preserve">СУМКА режет инвентарь того же позывного, если он в эфире и в том же измерении. Чем дальше тело от отметки, тем больше чёрных слотов. Часть видимых чисел врёт. Цена и откат в конфиге: opticCost, peekCost.</w:t>
+        <w:t xml:space="preserve">РАЙОН и СУМКА</w:t>
+      </w:r>
+    </w:p>
+    <w:p>
+      <w:pPr>
+        <w:pStyle w:val="Normal"/>
+      </w:pPr>
+      <w:r>
+        <w:t xml:space="preserve">Вкладка РАЙОН — это не карта мира и не камера. Такой вид отдал бы точные координаты и обнулил погрешность. Кнопка СНЯТЬ снимает землю вокруг сохранённой отметки: 16 на 16 клеток, дыры, сдвиг, цвет блоков. Красная точка появляется, только если носитель попал в этот кадр. Иначе на экране пеленг «за кадром», и VPN может его соврать.</w:t>
+      </w:r>
+    </w:p>
+    <w:p>
+      <w:pPr>
+        <w:pStyle w:val="Normal"/>
+      </w:pPr>
+      <w:r>
+        <w:t xml:space="preserve">СУМКА режет инвентарь того же позывного, если он в эфире и в том же измерении. Наведи на предмет: имя, чары, прочность, как в обычном инвентаре. Чем дальше тело от отметки, тем больше тёмных слотов. Часть чисел врёт. Цена и откат в конфиге: opticCost, peekCost.</w:t>
       </w:r>
     </w:p>
     <w:p>
@@ -695,15 +695,15 @@
         <w:pStyle w:val="List"/>
       </w:pPr>
       <w:r>
-        <w:t xml:space="preserve">SELL INTEL продаёт выбранную отметку. Цена по умолчанию 24. Напиши в строке $число, чтобы задать свою, от 1 до 5000.</w:t>
-      </w:r>
-    </w:p>
-    <w:p>
-      <w:pPr>
-        <w:pStyle w:val="List"/>
-      </w:pPr>
-      <w:r>
-        <w:t xml:space="preserve">Вкладка СЛОТ: перетащи предмет из инвентаря в слот справа. Цена — ползунок или число, за всю стопку. Телефон и ноутбук в слот не кладутся. SELL INTEL продаёт выбранный след за ту же цену.</w:t>
+        <w:t xml:space="preserve">ПРОДАТЬ СЛЕД продаёт выбранную отметку. Цена с ползунка или из поля, от 1 до 5000.</w:t>
+      </w:r>
+    </w:p>
+    <w:p>
+      <w:pPr>
+        <w:pStyle w:val="List"/>
+      </w:pPr>
+      <w:r>
+        <w:t xml:space="preserve">Вкладка ТОРГ: перетащи предмет из инвентаря в верхний слот. Цена — ползунок или число, за всю стопку. Телефон и ноутбук в слот не кладутся. ПРОДАТЬ СЛЕД продаёт выбранный след за ту же цену.</w:t>
       </w:r>
     </w:p>
     <w:p>
@@ -911,15 +911,15 @@
         <w:pStyle w:val="List"/>
       </w:pPr>
       <w:r>
-        <w:t xml:space="preserve">Чип VPN — кривой след и блок деанона. Повторно не ставится.</w:t>
-      </w:r>
-    </w:p>
-    <w:p>
-      <w:pPr>
-        <w:pStyle w:val="List"/>
-      </w:pPr>
-      <w:r>
-        <w:t xml:space="preserve">Глубокий VPN — заменяет обычный. След чаще срывается, погрешность больше, деанон без нулевого дня не проходит.</w:t>
+        <w:t xml:space="preserve">Чип VPN — умножает погрешность следа на traceVpnMul, по умолчанию 1.5, и блокирует деанон. Повторно не ставится.</w:t>
+      </w:r>
+    </w:p>
+    <w:p>
+      <w:pPr>
+        <w:pStyle w:val="List"/>
+      </w:pPr>
+      <w:r>
+        <w:t xml:space="preserve">Глубокий VPN — заменяет обычный. Множитель traceVpnDeepMul, по умолчанию 2. След чаще срывается, деанон без нулевого дня не проходит.</w:t>
       </w:r>
     </w:p>
     <w:p>
@@ -1791,7 +1791,7 @@
         <w:pStyle w:val="List"/>
       </w:pPr>
       <w:r>
-        <w:t xml:space="preserve">Погрешность TRACE: traceScatter + traceVpnError за уровень VPN. Дефолт 500 и 50. Тарелка ужимает, старая отметка добавляет traceStaleError.</w:t>
+        <w:t xml:space="preserve">Погрешность TRACE: база traceScatter, обычный VPN ×traceVpnMul, глубокий ×traceVpnDeepMul. Дефолт 500, 1.5 и 2. Старый traceVpnError не читается. Тарелка ужимает, старая отметка добавляет traceStaleError.</w:t>
       </w:r>
     </w:p>
     <w:p>

</xml_diff>

<commit_message>
Redraw the phone market as an auction board.
Lots show an item icon and a price. Hover opens the usual item card, and buy is a separate button so a misclick does not spend coins.

Co-authored-by: arena-agent <297053741+arena-agent@users.noreply.github.com>
</commit_message>
<xml_diff>
--- a/docs/cherny-kanal-gajd.docx
+++ b/docs/cherny-kanal-gajd.docx
@@ -327,7 +327,7 @@
         <w:pStyle w:val="Normal"/>
       </w:pPr>
       <w:r>
-        <w:t xml:space="preserve">Покупается за коряжма-коины из кошелька, не за изумруды. Предмет падает в инвентарь. Наведи на кнопку: цена не обрезается.</w:t>
+        <w:t xml:space="preserve">Покупается за коряжма-коины из кошелька, не за изумруды. Предмет падает в инвентарь. Рынок на телефоне — доска, как аукцион: лавка, чужие лоты и награды на разных вкладках. У лота иконка и цена. Наведи — имя, чары, прочность. Клик выбирает, КУПИТЬ списывает коины. Красная цена значит, что в кошельке не хватает.</w:t>
       </w:r>
     </w:p>
     <w:p>
@@ -359,7 +359,7 @@
         <w:pStyle w:val="List"/>
       </w:pPr>
       <w:r>
-        <w:t xml:space="preserve">Ниже каталога видны чужие объявления и награды. Объявление покупается кнопкой. Награда сдаётся не кнопкой, а образцом сигнала в руке.</w:t>
+        <w:t xml:space="preserve">Вкладка ДОСКА — чужие лоты с ноутбука. Если их больше восемнадцати, листай стрелками или колёсиком. Награда сдаётся не кнопкой, а образцом сигнала в руке.</w:t>
       </w:r>
     </w:p>
     <w:p>

</xml_diff>

<commit_message>
Make flood harder to mute, hide listing coordinates, and let chips be sold.
Airplane mode no longer clears an active flood timer. Flood text, sounds, and popup images come from config. Market traces show cursed coordinates until purchase, and installed chips can be sold for half price.

Co-authored-by: arena-agent <297053741+arena-agent@users.noreply.github.com>
</commit_message>
<xml_diff>
--- a/docs/cherny-kanal-gajd.docx
+++ b/docs/cherny-kanal-gajd.docx
@@ -271,7 +271,7 @@
         <w:pStyle w:val="Normal"/>
       </w:pPr>
       <w:r>
-        <w:t xml:space="preserve">Телефон видит игроков на 52 блока, ноутбук на 110. Берётся большее, они не складываются. Своя или отрядная тарелка добавляет dishRadarBonus, по умолчанию 80, и один раз. Чужая тарелка дальность не растит. Стойки, тарелки, глушилки, клетки, рации EW и радары Ballistix видны дальше: structureRadar 360 с ноутбука, 180 с телефона. Игроков это не удлиняет. Глушилка и клетка гасят стойку внутри сферы: нет канала, нет чекана. Разряженная батарея гасит и твой радар, и твою отметку.</w:t>
+        <w:t xml:space="preserve">Телефон видит игроков на 52 блока, ноутбук на 110. Берётся большее, они не складываются. Два телефона, два ноутбука или пять тарелок дальность не умножают. Своя или отрядная тарелка добавляет dishRadarBonus, по умолчанию 80, и один раз, если тарелка ближе 128 блоков. Чужая тарелка дальность не растит. Радары Ballistix на карте видны как чужие станции, их дальность к твоей не прибавляется. Стойки, тарелки, глушилки, клетки, рации EW и радары Ballistix видны дальше: structureRadar 360 с ноутбука, 180 с телефона. Игроков это не удлиняет. Глушилка и клетка гасят стойку внутри сферы: нет канала, нет чекана. Разряженная батарея гасит и твой радар, и твою отметку.</w:t>
       </w:r>
     </w:p>
     <w:p>
@@ -327,7 +327,7 @@
         <w:pStyle w:val="Normal"/>
       </w:pPr>
       <w:r>
-        <w:t xml:space="preserve">Покупается за коряжма-коины из кошелька, не за изумруды. Предмет падает в инвентарь. Рынок на телефоне — доска, как аукцион: лавка, чужие лоты и награды на разных вкладках. У лота иконка и цена. Наведи — имя, чары, прочность. Клик выбирает, КУПИТЬ списывает коины. Красная цена значит, что в кошельке не хватает.</w:t>
+        <w:t xml:space="preserve">Покупается за коряжма-коины из кошелька, не за изумруды. Предмет падает в инвентарь. Рынок на телефоне — доска, как аукцион: лавка, чужие лоты и награды на разных вкладках. У лота иконка и цена. Наведи — имя, чары, прочность. Клик выбирает, КУПИТЬ списывает коины. Красная цена значит, что в кошельке не хватает. У чужого следа на доске видны позывной и измерение. Координаты написаны проклятым шрифтом и в пакете их нет: настоящие X Y Z приходят только после покупки, во вкладку СЛЕД.</w:t>
       </w:r>
     </w:p>
     <w:p>
@@ -495,7 +495,7 @@
         <w:pStyle w:val="Normal"/>
       </w:pPr>
       <w:r>
-        <w:t xml:space="preserve">Перезарядка 60 секунд. Это ник Minecraft, не настоящий человек. Список копится до 24 имён.</w:t>
+        <w:t xml:space="preserve">Перезарядка 60 секунд. Это ник Minecraft, не настоящий человек. Список копится до 24 имён. Смысл не в таблице: после деанона VPN этой цели на твоём радаре перестаёт прятать имя и сдвигать точку. Если цель сожжёт позывной, ник Minecraft остаётся, и ты всё ещё знаешь, кто это в табе и в обычном чате.</w:t>
       </w:r>
     </w:p>
     <w:p>
@@ -615,7 +615,7 @@
         <w:pStyle w:val="List"/>
       </w:pPr>
       <w:r>
-        <w:t xml:space="preserve">Пока флуд идёт, с трубки можно только авиарежим, DND и гашение. Авиарежим обрывает флуд сразу.</w:t>
+        <w:t xml:space="preserve">Пока флуд идёт, с трубки можно только авиарежим, DND и гашение. Авиарежим только глушит флуд: таймер тикает дальше. Выключил авиарежим, а время не вышло — спам, звук и картинки возвращаются. Текст, звуки и картинки правятся в конфиге: floodLines, floodSounds, floodImages, floodSoundVolume, floodSoundTicks, floodChatTicks. Свои PNG кладутся в config/blackchannel/flood, до 4 файлов по 48 КБ, и их видит цель. Путь ресурспака пишется в floodImages.</w:t>
       </w:r>
     </w:p>
     <w:p>
@@ -911,7 +911,7 @@
         <w:pStyle w:val="List"/>
       </w:pPr>
       <w:r>
-        <w:t xml:space="preserve">Чип VPN — умножает погрешность следа на traceVpnMul, по умолчанию 1.5, и блокирует деанон. Повторно не ставится.</w:t>
+        <w:t xml:space="preserve">Чип VPN — умножает погрешность следа на traceVpnMul, по умолчанию 1.5, и блокирует деанон. Повторно не ставится. На вкладке сети телефона чипы видны списком. ПРОДАТЬ возвращает половину цены в кошелёк и снимает чип. Если кошелёк уже на 5000, продажа не проходит и чип остаётся.</w:t>
       </w:r>
     </w:p>
     <w:p>

</xml_diff>

<commit_message>
Add a fixed-border evening match and ways to learn a handle without a phone.
Players set a map center and size, drop in crew clusters, and respawn at a bed or their own point. Handles can be read up close, from a dog tag, or from a honeypot, without a live trace of a dark player.

Co-authored-by: arena-agent <297053741+arena-agent@users.noreply.github.com>
</commit_message>
<xml_diff>
--- a/docs/cherny-kanal-gajd.docx
+++ b/docs/cherny-kanal-gajd.docx
@@ -15,7 +15,7 @@
         <w:pStyle w:val="Normal"/>
       </w:pPr>
       <w:r>
-        <w:t xml:space="preserve">Полный гайд для друзей и для того, кто крутит сервер. Версия мода 1.0.0, Minecraft 1.20.1, Forge 47.3.0. Дата гайда: 23 октября 2026.</w:t>
+        <w:t xml:space="preserve">Полный гайд для друзей и для того, кто крутит сервер. Версия мода 1.0.0, Minecraft 1.20.1, Forge 47.3.0. Дата гайда: 29 октября 2026.</w:t>
       </w:r>
     </w:p>
     <w:p>
@@ -1775,7 +1775,7 @@
         <w:pStyle w:val="List"/>
       </w:pPr>
       <w:r>
-        <w:t xml:space="preserve">Батарея садится на 1% раз в 15 секунд, пока ты в эфире. Элемент даёт 60%. Стойка заряжает трубку за 150 заряда.</w:t>
+        <w:t xml:space="preserve">Батарея в эфире теряет 1 заряд раз в 15 секунд, плюс 1 за каждый чип: VPN, IDS, закалка. Глубокий VPN считается за один чип, не за два. Ноль чипов — 25 минут, один — 12,5, два — около 8, три — около 6. На вкладке сети видно число расхода. Элемент даёт 60%. Стойка заряжает трубку за 150 заряда.</w:t>
       </w:r>
     </w:p>
     <w:p>
@@ -1799,7 +1799,119 @@
         <w:pStyle w:val="Heading1"/>
       </w:pPr>
       <w:r>
-        <w:t xml:space="preserve">14. Если что-то не работает</w:t>
+        <w:t xml:space="preserve">14. Вечерняя катка</w:t>
+      </w:r>
+    </w:p>
+    <w:p>
+      <w:pPr>
+        <w:pStyle w:val="Normal"/>
+      </w:pPr>
+      <w:r>
+        <w:t xml:space="preserve">Это не батл-рояль и не голодные игры. Граница стоит на месте и не сужается. Мир ставишь сам: обычный, или скачанный город. Мод город не генерирует и чужие сундуки города не переписывает.</w:t>
+      </w:r>
+    </w:p>
+    <w:p>
+      <w:pPr>
+        <w:pStyle w:val="List"/>
+      </w:pPr>
+      <w:r>
+        <w:t xml:space="preserve">/minigame center — встать в центр карты. Или /minigame center x y z.</w:t>
+      </w:r>
+    </w:p>
+    <w:p>
+      <w:pPr>
+        <w:pStyle w:val="List"/>
+      </w:pPr>
+      <w:r>
+        <w:t xml:space="preserve">/minigame size 2500 — расстояние от стены до стены. Для карты 2500×2500 пиши 2500, не 1250. Разрыв между отрядами выйдет около 400. На маленькой карте разрыв сам сожмётся, но не ниже 48.</w:t>
+      </w:r>
+    </w:p>
+    <w:p>
+      <w:pPr>
+        <w:pStyle w:val="List"/>
+      </w:pPr>
+      <w:r>
+        <w:t xml:space="preserve">/minigame crew код — до старта, телефон не нужен. Одинаковый код сажает кучкой. Пустая команда /minigame crew — соло, и соло тоже получает свою точку, не общую кучу.</w:t>
+      </w:r>
+    </w:p>
+    <w:p>
+      <w:pPr>
+        <w:pStyle w:val="List"/>
+      </w:pPr>
+      <w:r>
+        <w:t xml:space="preserve">/minigame start — телепорт, телефон с батареей, один элемент и книжка, если их ещё нет. 60 секунд игроки не бьют игроков. Потом можно и строить, и охотиться. /minigame stop возвращает границу и не стирает мир.</w:t>
+      </w:r>
+    </w:p>
+    <w:p>
+      <w:pPr>
+        <w:pStyle w:val="List"/>
+      </w:pPr>
+      <w:r>
+        <w:t xml:space="preserve">Смерть не кончает вечер. Вещи падают. Респавн: своя кровать, если она стоит и не за барьером. Иначе своя точка с начала катки. Чужая кровать и маяк отряда точкой возврата не являются. Новая смерть телефон заново не выдаёт.</w:t>
+      </w:r>
+    </w:p>
+    <w:p>
+      <w:pPr>
+        <w:pStyle w:val="List"/>
+      </w:pPr>
+      <w:r>
+        <w:t xml:space="preserve">Схроны мод ставит сам, не ближе 150 блоков от чужой кучи, и не сеткой. В них компоненты, иногда ноутбук, стойка, тарелка, нижняя ракета. На всю карту одна-две недостающие детали конца цепочки: стержень, ячейка антиматерии или ячейка тёмной материи. Готовой бомбы в сундуке нет. Сундук данжа, у которого ещё висит таблица лута, получает добавку железа и редстоуна, когда чанк загрузится. Уже заполненный городской сундук без таблицы данжа не трогаем.</w:t>
+      </w:r>
+    </w:p>
+    <w:p>
+      <w:pPr>
+        <w:pStyle w:val="Heading1"/>
+      </w:pPr>
+      <w:r>
+        <w:t xml:space="preserve">15. Позывной без телефона у цели</w:t>
+      </w:r>
+    </w:p>
+    <w:p>
+      <w:pPr>
+        <w:pStyle w:val="Normal"/>
+      </w:pPr>
+      <w:r>
+        <w:t xml:space="preserve">Позывной сервер выдаёт каждому сразу. Список всех позывных не публикуется. Узнать его можно и у того, кто никогда не держал трубку и не выходил в эфир. Это имя, не координаты. Живой след по тёмному игроку по-прежнему не ставится.</w:t>
+      </w:r>
+    </w:p>
+    <w:p>
+      <w:pPr>
+        <w:pStyle w:val="List"/>
+      </w:pPr>
+      <w:r>
+        <w:t xml:space="preserve">Телефон в руке, ПКМ по игроку в 5 блоках: позывной и ник. Стоит 8 заряда. Авиарежим цели не мешает, это не радио.</w:t>
+      </w:r>
+    </w:p>
+    <w:p>
+      <w:pPr>
+        <w:pStyle w:val="List"/>
+      </w:pPr>
+      <w:r>
+        <w:t xml:space="preserve">Если тебя ударили, а телефон есть в инвентаре, позывной бьющего записывается. Координат нет.</w:t>
+      </w:r>
+    </w:p>
+    <w:p>
+      <w:pPr>
+        <w:pStyle w:val="List"/>
+      </w:pPr>
+      <w:r>
+        <w:t xml:space="preserve">С трупа падает жетон: позывной, ник, место смерти. ПКМ жетоном при своём телефоне кладёт это место во вкладку СЛЕД с погрешностью 80. Это где он умер, не где он сейчас.</w:t>
+      </w:r>
+    </w:p>
+    <w:p>
+      <w:pPr>
+        <w:pStyle w:val="List"/>
+      </w:pPr>
+      <w:r>
+        <w:t xml:space="preserve">Приманка: железо, редстоун, бумага. Без шифта вешается на сундук, шифт ставит блок. Три записи. Ловит того, кто открыл сундук или подошёл на 3 блока, даже без телефона. Владельцу приходит место ловушки, погрешность 32. Это не настоящий IP и не адрес компьютера. Свой отряд приманка не пишет. IDS у цели пищит пеленг, без координат ловушки.</w:t>
+      </w:r>
+    </w:p>
+    <w:p>
+      <w:pPr>
+        <w:pStyle w:val="Heading1"/>
+      </w:pPr>
+      <w:r>
+        <w:t xml:space="preserve">16. Если что-то не работает</w:t>
       </w:r>
     </w:p>
     <w:p>

</xml_diff>

<commit_message>
Save handles from radar range and stop filing fake death coordinates.
A placed honeypot logs every handle within 50 blocks without a live fix. Cache loot is config lists, and dark matter is no longer in the default chests.

Co-authored-by: arena-agent <297053741+arena-agent@users.noreply.github.com>
</commit_message>
<xml_diff>
--- a/docs/cherny-kanal-gajd.docx
+++ b/docs/cherny-kanal-gajd.docx
@@ -1855,7 +1855,7 @@
         <w:pStyle w:val="List"/>
       </w:pPr>
       <w:r>
-        <w:t xml:space="preserve">Схроны мод ставит сам, не ближе 150 блоков от чужой кучи, и не сеткой. В них компоненты, иногда ноутбук, стойка, тарелка, нижняя ракета. На всю карту одна-две недостающие детали конца цепочки: стержень, ячейка антиматерии или ячейка тёмной материи. Готовой бомбы в сундуке нет. Сундук данжа, у которого ещё висит таблица лута, получает добавку железа и редстоуна, когда чанк загрузится. Уже заполненный городской сундук без таблицы данжа не трогаем.</w:t>
+        <w:t xml:space="preserve">Схроны мод ставит сам, не ближе 150 блоков от чужой кучи, и не сеткой. Что внутри — списки cacheCommon, cacheUncommon и cacheRare в config/blackchannel-common.toml. Строка вида modid:item или modid:item*3-8. Тёмной материи, антиматерии и стержня урана в списке нет. Если хочешь их в схроне, допиши id сам. Сундук данжа с ещё живой таблицей лута получает cacheDungeon, когда чанк загрузится. Городской сундук без таблицы данжа не трогаем.</w:t>
       </w:r>
     </w:p>
     <w:p>
@@ -1871,39 +1871,31 @@
         <w:pStyle w:val="Normal"/>
       </w:pPr>
       <w:r>
-        <w:t xml:space="preserve">Позывной сервер выдаёт каждому сразу. Список всех позывных не публикуется. Узнать его можно и у того, кто никогда не держал трубку и не выходил в эфир. Это имя, не координаты. Живой след по тёмному игроку по-прежнему не ставится.</w:t>
-      </w:r>
-    </w:p>
-    <w:p>
-      <w:pPr>
-        <w:pStyle w:val="List"/>
-      </w:pPr>
-      <w:r>
-        <w:t xml:space="preserve">Телефон в руке, ПКМ по игроку в 5 блоках: позывной и ник. Стоит 8 заряда. Авиарежим цели не мешает, это не радио.</w:t>
-      </w:r>
-    </w:p>
-    <w:p>
-      <w:pPr>
-        <w:pStyle w:val="List"/>
-      </w:pPr>
-      <w:r>
-        <w:t xml:space="preserve">Если тебя ударили, а телефон есть в инвентаре, позывной бьющего записывается. Координат нет.</w:t>
-      </w:r>
-    </w:p>
-    <w:p>
-      <w:pPr>
-        <w:pStyle w:val="List"/>
-      </w:pPr>
-      <w:r>
-        <w:t xml:space="preserve">С трупа падает жетон: позывной, ник, место смерти. ПКМ жетоном при своём телефоне кладёт это место во вкладку СЛЕД с погрешностью 80. Это где он умер, не где он сейчас.</w:t>
-      </w:r>
-    </w:p>
-    <w:p>
-      <w:pPr>
-        <w:pStyle w:val="List"/>
-      </w:pPr>
-      <w:r>
-        <w:t xml:space="preserve">Приманка: железо, редстоун, бумага. Без шифта вешается на сундук, шифт ставит блок. Три записи. Ловит того, кто открыл сундук или подошёл на 3 блока, даже без телефона. Владельцу приходит место ловушки, погрешность 32. Это не настоящий IP и не адрес компьютера. Свой отряд приманка не пишет. IDS у цели пищит пеленг, без координат ловушки.</w:t>
+        <w:t xml:space="preserve">Позывной сервер выдаёт каждому сразу. Списка всех нет. Это имя, не координаты. Живой след по тёмному игроку по-прежнему не ставится. VPN по-прежнему прячет ник на радаре, пока нет деанона.</w:t>
+      </w:r>
+    </w:p>
+    <w:p>
+      <w:pPr>
+        <w:pStyle w:val="List"/>
+      </w:pPr>
+      <w:r>
+        <w:t xml:space="preserve">Если игрок в эфире и попал на твой радар, позывной записывается на вкладку сети. Телефон — 52 блока, ноутбук — 110, своя тарелка добавляет бонус один раз. Координат сверх точки на радаре это не даёт. Человек без трубки на радар не попадает.</w:t>
+      </w:r>
+    </w:p>
+    <w:p>
+      <w:pPr>
+        <w:pStyle w:val="List"/>
+      </w:pPr>
+      <w:r>
+        <w:t xml:space="preserve">Приманка блоком пишет все позывные в loggerRadius, по умолчанию 50, даже если у цели нет телефона. Координат нет: ты и так знаешь, что он был у блока. На сундук без шифта — три коротких записи рядом с сундуком. Свой отряд не пишется. IDS пищит пеленг. Это игровой позывной, не IP.</w:t>
+      </w:r>
+    </w:p>
+    <w:p>
+      <w:pPr>
+        <w:pStyle w:val="List"/>
+      </w:pPr>
+      <w:r>
+        <w:t xml:space="preserve">Жетон с трупа даёт позывной и ник, не точку. Место смерти ты и так видел, погрешность к нему не клеится.</w:t>
       </w:r>
     </w:p>
     <w:p>

</xml_diff>